<commit_message>
BRD-11 interface specification: no break-glass accounts; every user signs in through Entra ID
Co-Authored-By: Claude Opus 5.5 <noreply@anthropic.com>
Claude-Session: https://claude.ai/code/session_01W3DAuLtsQmip7EuxjJCCtN
</commit_message>
<xml_diff>
--- a/docs/deliverables/out/Programme/BDOI_Template_FRS/BRD-11_User_Access_Maintenance/BIBS_ICD-BDOI_BRD-11_User_Access_Interface_Specification_v1.0.docx
+++ b/docs/deliverables/out/Programme/BDOI_Template_FRS/BRD-11_User_Access_Maintenance/BIBS_ICD-BDOI_BRD-11_User_Access_Interface_Specification_v1.0.docx
@@ -2236,7 +2236,7 @@
         </w:tabs>
       </w:pPr>
       <w:r>
-        <w:t xml:space="preserve">Leavers and Break-glass Accounts</w:t>
+        <w:t xml:space="preserve">Leavers and Local Passwords</w:t>
       </w:r>
       <w:r>
         <w:tab/>
@@ -3441,7 +3441,7 @@
                 <w:i w:val="0"/>
                 <w:sz w:val="18"/>
               </w:rPr>
-              <w:t>Reviews refused events and reconciliation mismatches in Identity Synchronisation; keeps a break-glass password.</w:t>
+              <w:t>Reviews refused events and reconciliation mismatches in Identity Synchronisation. Signs in through Microsoft Entra ID like every user.</w:t>
             </w:r>
           </w:p>
         </w:tc>
@@ -20140,7 +20140,7 @@
           <w:i w:val="0"/>
           <w:sz w:val="20"/>
         </w:rPr>
-        <w:t>Group profiles are checked before anything is applied: the profile exists, it is active, the profiles of the user break no separation-of-duties rule and combine no conflicting permissions.</w:t>
+        <w:t>Group profiles are checked before anything is applied: the profile exists, it is active, the profiles of the user violate no separation-of-duties rule and combine no conflicting permissions.</w:t>
       </w:r>
     </w:p>
     <w:p>
@@ -24030,7 +24030,7 @@
         <w:pStyle w:val="Heading2"/>
       </w:pPr>
       <w:r>
-        <w:t>Leavers and Break-glass Accounts</w:t>
+        <w:t>Leavers and Local Passwords</w:t>
       </w:r>
     </w:p>
     <w:p>
@@ -24093,7 +24093,7 @@
         </w:rPr>
         <w:t>•</w:t>
         <w:tab/>
-        <w:t>Named break-glass System Administrators keep a local password with a second factor, for use when Entra ID is unavailable (OP-10).</w:t>
+        <w:t>Every user signs in through Microsoft Entra ID, System Administrators included. Local passwords exist only for test accounts in DEV, SIT and UAT. Production refuses sign-in with a local password.</w:t>
       </w:r>
     </w:p>
     <w:p>
@@ -26393,87 +26393,6 @@
           </w:p>
         </w:tc>
       </w:tr>
-      <w:tr>
-        <w:trPr>
-          <w:cantSplit/>
-        </w:trPr>
-        <w:tc>
-          <w:tcPr>
-            <w:tcW w:type="dxa" w:w="806"/>
-          </w:tcPr>
-          <w:p>
-            <w:pPr>
-              <w:spacing w:before="20" w:after="20"/>
-            </w:pPr>
-            <w:r>
-              <w:rPr>
-                <w:rFonts w:ascii="Arial" w:hAnsi="Arial" w:cs="Arial" w:eastAsia="Arial"/>
-                <w:b w:val="0"/>
-                <w:i w:val="0"/>
-                <w:sz w:val="18"/>
-              </w:rPr>
-              <w:t>OP-10</w:t>
-            </w:r>
-          </w:p>
-        </w:tc>
-        <w:tc>
-          <w:tcPr>
-            <w:tcW w:type="dxa" w:w="4723"/>
-          </w:tcPr>
-          <w:p>
-            <w:pPr>
-              <w:spacing w:before="20" w:after="20"/>
-            </w:pPr>
-            <w:r>
-              <w:rPr>
-                <w:rFonts w:ascii="Arial" w:hAnsi="Arial" w:cs="Arial" w:eastAsia="Arial"/>
-                <w:b w:val="0"/>
-                <w:i w:val="0"/>
-                <w:sz w:val="18"/>
-              </w:rPr>
-              <w:t>Names of the break-glass System Administrators who keep a local password</w:t>
-            </w:r>
-          </w:p>
-        </w:tc>
-        <w:tc>
-          <w:tcPr>
-            <w:tcW w:type="dxa" w:w="1728"/>
-          </w:tcPr>
-          <w:p>
-            <w:pPr>
-              <w:spacing w:before="20" w:after="20"/>
-            </w:pPr>
-            <w:r>
-              <w:rPr>
-                <w:rFonts w:ascii="Arial" w:hAnsi="Arial" w:cs="Arial" w:eastAsia="Arial"/>
-                <w:b w:val="0"/>
-                <w:i w:val="0"/>
-                <w:sz w:val="18"/>
-              </w:rPr>
-              <w:t>BDOI Information Security</w:t>
-            </w:r>
-          </w:p>
-        </w:tc>
-        <w:tc>
-          <w:tcPr>
-            <w:tcW w:type="dxa" w:w="1382"/>
-          </w:tcPr>
-          <w:p>
-            <w:pPr>
-              <w:spacing w:before="20" w:after="20"/>
-            </w:pPr>
-            <w:r>
-              <w:rPr>
-                <w:rFonts w:ascii="Arial" w:hAnsi="Arial" w:cs="Arial" w:eastAsia="Arial"/>
-                <w:b w:val="0"/>
-                <w:i w:val="0"/>
-                <w:sz w:val="18"/>
-              </w:rPr>
-              <w:t>Before production</w:t>
-            </w:r>
-          </w:p>
-        </w:tc>
-      </w:tr>
     </w:tbl>
     <w:p>
       <w:pPr>
@@ -26718,7 +26637,7 @@
                 <w:i w:val="0"/>
                 <w:sz w:val="18"/>
               </w:rPr>
-              <w:t>Break-glass administrator</w:t>
+              <w:t>Local password</w:t>
             </w:r>
           </w:p>
         </w:tc>
@@ -26737,7 +26656,7 @@
                 <w:i w:val="0"/>
                 <w:sz w:val="18"/>
               </w:rPr>
-              <w:t>Named System Administrator who keeps a local password with a second factor for use when single sign-on is unavailable</w:t>
+              <w:t>Password kept in BIBS; only for test accounts in DEV, SIT and UAT. Production refuses sign-in with a local password</w:t>
             </w:r>
           </w:p>
         </w:tc>

</xml_diff>